<commit_message>
Finalize author declarations and citation order
</commit_message>
<xml_diff>
--- a/submission/bmc_medical_genomics_2026-05-01/COVER_LETTER_DRAFT.docx
+++ b/submission/bmc_medical_genomics_2026-05-01/COVER_LETTER_DRAFT.docx
@@ -65,7 +65,7 @@
         <w:spacing w:line="276" w:lineRule="auto" w:after="160"/>
       </w:pPr>
       <w:r>
-        <w:t xml:space="preserve">All analyzed datasets are publicly available or open-access processed resources. The analysis scripts, compact result tables, figure outputs, and validation reports are organized in a version-controlled project repository, with repository access information to be finalized before submission.</w:t>
+        <w:t xml:space="preserve">All analyzed datasets are publicly available or open-access processed resources. The analysis scripts, compact result tables, figure outputs, and validation reports are organized in a version-controlled project repository at https://github.com/1627626277-cyber/secondary. The full local project push should be checked before journal upload.</w:t>
       </w:r>
     </w:p>
     <w:p>
@@ -74,7 +74,7 @@
         <w:spacing w:line="276" w:lineRule="auto" w:after="160"/>
       </w:pPr>
       <w:r>
-        <w:t xml:space="preserve">This manuscript has not been published and is not under consideration elsewhere. All authors have approved the manuscript for submission. [Author confirmation required.]</w:t>
+        <w:t xml:space="preserve">This manuscript has not been published and is not under consideration elsewhere. The author confirms responsibility for the submitted work. [Final author confirmation required before upload.]</w:t>
       </w:r>
     </w:p>
     <w:p>
@@ -92,7 +92,7 @@
         <w:spacing w:line="276" w:lineRule="auto" w:after="160"/>
       </w:pPr>
       <w:r>
-        <w:t xml:space="preserve">[Corresponding author name]</w:t>
+        <w:t xml:space="preserve">Zhuang Jiang</w:t>
       </w:r>
     </w:p>
     <w:p>
@@ -101,7 +101,7 @@
         <w:spacing w:line="276" w:lineRule="auto" w:after="160"/>
       </w:pPr>
       <w:r>
-        <w:t xml:space="preserve">[Institution]</w:t>
+        <w:t xml:space="preserve">Guangdong University of Petrochemical Technology (GDUPT)</w:t>
       </w:r>
     </w:p>
     <w:p>
@@ -110,7 +110,7 @@
         <w:spacing w:line="276" w:lineRule="auto" w:after="160"/>
       </w:pPr>
       <w:r>
-        <w:t xml:space="preserve">[Email]</w:t>
+        <w:t xml:space="preserve">[Corresponding author email to be confirmed]</w:t>
       </w:r>
     </w:p>
     <w:sectPr>

</xml_diff>

<commit_message>
Add ORCID and final citation prep
</commit_message>
<xml_diff>
--- a/submission/bmc_medical_genomics_2026-05-01/COVER_LETTER_DRAFT.docx
+++ b/submission/bmc_medical_genomics_2026-05-01/COVER_LETTER_DRAFT.docx
@@ -4,20 +4,32 @@
   <w:body>
     <w:p>
       <w:pPr>
-        <w:pStyle w:val="Title"/>
+        <w:pStyle w:val="FirstParagraph"/>
         <w:spacing w:line="276" w:lineRule="auto" w:after="160"/>
       </w:pPr>
       <w:r>
-        <w:t xml:space="preserve">Cover Letter</w:t>
+        <w:t xml:space="preserve">Dear Editor,</w:t>
       </w:r>
     </w:p>
     <w:p>
       <w:pPr>
-        <w:pStyle w:val="FirstParagraph"/>
+        <w:pStyle w:val="BodyText"/>
         <w:spacing w:line="276" w:lineRule="auto" w:after="160"/>
       </w:pPr>
       <w:r>
-        <w:t xml:space="preserve">Dear Editor,</w:t>
+        <w:t xml:space="preserve">We are pleased to submit our manuscript entitled</w:t>
+      </w:r>
+      <w:r>
+        <w:t xml:space="preserve"> </w:t>
+      </w:r>
+      <w:r>
+        <w:t xml:space="preserve">“Spatial validation and clinical association of a plasma-secretory bone marrow program in multiple myeloma”</w:t>
+      </w:r>
+      <w:r>
+        <w:t xml:space="preserve"> </w:t>
+      </w:r>
+      <w:r>
+        <w:t xml:space="preserve">for consideration in BMC Medical Genomics.</w:t>
       </w:r>
     </w:p>
     <w:p>
@@ -26,19 +38,7 @@
         <w:spacing w:line="276" w:lineRule="auto" w:after="160"/>
       </w:pPr>
       <w:r>
-        <w:t xml:space="preserve">We are pleased to submit our manuscript entitled</w:t>
-      </w:r>
-      <w:r>
-        <w:t xml:space="preserve"> </w:t>
-      </w:r>
-      <w:r>
-        <w:t xml:space="preserve">“Spatial validation and clinical association of a plasma-secretory bone marrow program in multiple myeloma”</w:t>
-      </w:r>
-      <w:r>
-        <w:t xml:space="preserve"> </w:t>
-      </w:r>
-      <w:r>
-        <w:t xml:space="preserve">for consideration in BMC Medical Genomics.</w:t>
+        <w:t xml:space="preserve">This manuscript presents an integrative public-data analysis of multiple myeloma using spatial transcriptomics, Xenium spatial profiling, single-cell RNA sequencing, external bulk transcriptomic cohorts, MMRF-COMMPASS/GDC RNA-seq, and public CoMMpass molecular annotations. The study identifies a plasma-secretory bone marrow program that is enriched in myeloma spatial transcriptomics, reproduced at program level in an independent Xenium dataset, localized to plasma-cell compartments in single-cell data, and associated with overall survival, ISS stage, PR RNA-subtype probability, and 1q21 molecular-risk features in bulk datasets.</w:t>
       </w:r>
     </w:p>
     <w:p>
@@ -47,7 +47,7 @@
         <w:spacing w:line="276" w:lineRule="auto" w:after="160"/>
       </w:pPr>
       <w:r>
-        <w:t xml:space="preserve">This manuscript presents an integrative public-data analysis of multiple myeloma using spatial transcriptomics, Xenium spatial profiling, single-cell RNA sequencing, external bulk transcriptomic cohorts, MMRF-COMMPASS/GDC RNA-seq, and public CoMMpass molecular annotations. The study identifies a plasma-secretory bone marrow program that is enriched in myeloma spatial transcriptomics, reproduced at program level in an independent Xenium dataset, localized to plasma-cell compartments in single-cell data, and associated with overall survival, ISS stage, PR RNA-subtype probability, and 1q21 molecular-risk features in bulk datasets.</w:t>
+        <w:t xml:space="preserve">The work is framed as a reproducible and clinically associated transcriptional program rather than as a completed clinical biomarker. The manuscript explicitly states that R-ISS, PFS, treatment-response validation, and wet-lab validation were not completed in the current public-data route. We believe this transparent scope is well aligned with the journal’s interest in genomic and transcriptomic analyses of disease biology.</w:t>
       </w:r>
     </w:p>
     <w:p>
@@ -56,7 +56,7 @@
         <w:spacing w:line="276" w:lineRule="auto" w:after="160"/>
       </w:pPr>
       <w:r>
-        <w:t xml:space="preserve">The work is framed as a reproducible and clinically associated transcriptional program rather than as a completed clinical biomarker. The manuscript explicitly states that R-ISS, PFS, treatment-response validation, and wet-lab validation were not completed in the current public-data route. We believe this transparent scope is well aligned with the journal’s interest in genomic and transcriptomic analyses of disease biology.</w:t>
+        <w:t xml:space="preserve">All analyzed datasets are publicly available or open-access processed resources. The analysis scripts, compact result tables, figure outputs, and validation reports are organized in a local reproducibility package and will be made publicly available before formal journal upload at https://github.com/1627626277-cyber/secondary.</w:t>
       </w:r>
     </w:p>
     <w:p>
@@ -65,7 +65,7 @@
         <w:spacing w:line="276" w:lineRule="auto" w:after="160"/>
       </w:pPr>
       <w:r>
-        <w:t xml:space="preserve">All analyzed datasets are publicly available or open-access processed resources. The analysis scripts, compact result tables, figure outputs, and validation reports are organized in a version-controlled project repository at https://github.com/1627626277-cyber/secondary. The full local project push should be checked before journal upload.</w:t>
+        <w:t xml:space="preserve">This manuscript has not been published and is not under consideration elsewhere. The author confirms responsibility for the submitted work.</w:t>
       </w:r>
     </w:p>
     <w:p>
@@ -74,7 +74,7 @@
         <w:spacing w:line="276" w:lineRule="auto" w:after="160"/>
       </w:pPr>
       <w:r>
-        <w:t xml:space="preserve">This manuscript has not been published and is not under consideration elsewhere. The author confirms responsibility for the submitted work. [Final author confirmation required before upload.]</w:t>
+        <w:t xml:space="preserve">Sincerely,</w:t>
       </w:r>
     </w:p>
     <w:p>
@@ -83,7 +83,7 @@
         <w:spacing w:line="276" w:lineRule="auto" w:after="160"/>
       </w:pPr>
       <w:r>
-        <w:t xml:space="preserve">Sincerely,</w:t>
+        <w:t xml:space="preserve">Zhuang Jiang</w:t>
       </w:r>
     </w:p>
     <w:p>
@@ -92,7 +92,7 @@
         <w:spacing w:line="276" w:lineRule="auto" w:after="160"/>
       </w:pPr>
       <w:r>
-        <w:t xml:space="preserve">Zhuang Jiang</w:t>
+        <w:t xml:space="preserve">Guangdong University of Petrochemical Technology (GDUPT)</w:t>
       </w:r>
     </w:p>
     <w:p>
@@ -101,16 +101,7 @@
         <w:spacing w:line="276" w:lineRule="auto" w:after="160"/>
       </w:pPr>
       <w:r>
-        <w:t xml:space="preserve">Guangdong University of Petrochemical Technology (GDUPT)</w:t>
-      </w:r>
-    </w:p>
-    <w:p>
-      <w:pPr>
-        <w:pStyle w:val="BodyText"/>
-        <w:spacing w:line="276" w:lineRule="auto" w:after="160"/>
-      </w:pPr>
-      <w:r>
-        <w:t xml:space="preserve">[Corresponding author email to be confirmed]</w:t>
+        <w:t xml:space="preserve">1627626277@qq.com</w:t>
       </w:r>
     </w:p>
     <w:sectPr>

</xml_diff>

<commit_message>
Rewrite results and complete stage 2.5 review
</commit_message>
<xml_diff>
--- a/submission/bmc_medical_genomics_2026-05-01/COVER_LETTER_DRAFT.docx
+++ b/submission/bmc_medical_genomics_2026-05-01/COVER_LETTER_DRAFT.docx
@@ -83,7 +83,7 @@
         <w:spacing w:line="276" w:lineRule="auto" w:after="160"/>
       </w:pPr>
       <w:r>
-        <w:t xml:space="preserve">Zhuang Jiang</w:t>
+        <w:t xml:space="preserve">[Corresponding author to be finalized before submission]</w:t>
       </w:r>
     </w:p>
     <w:p>
@@ -101,7 +101,7 @@
         <w:spacing w:line="276" w:lineRule="auto" w:after="160"/>
       </w:pPr>
       <w:r>
-        <w:t xml:space="preserve">1627626277@qq.com</w:t>
+        <w:t xml:space="preserve">[corresponding author email to be finalized before submission]</w:t>
       </w:r>
     </w:p>
     <w:sectPr>

</xml_diff>

<commit_message>
Sync submission package and validation outputs
</commit_message>
<xml_diff>
--- a/submission/bmc_medical_genomics_2026-05-01/COVER_LETTER_DRAFT.docx
+++ b/submission/bmc_medical_genomics_2026-05-01/COVER_LETTER_DRAFT.docx
@@ -23,7 +23,7 @@
         <w:t xml:space="preserve"> </w:t>
       </w:r>
       <w:r>
-        <w:t xml:space="preserve">“Spatial validation and clinical association of a plasma-secretory bone marrow program in multiple myeloma”</w:t>
+        <w:t xml:space="preserve">“A spatially reproducible plasma-secretory bone marrow program linked to molecular risk in multiple myeloma”</w:t>
       </w:r>
       <w:r>
         <w:t xml:space="preserve"> </w:t>
@@ -38,7 +38,7 @@
         <w:spacing w:line="276" w:lineRule="auto" w:after="160"/>
       </w:pPr>
       <w:r>
-        <w:t xml:space="preserve">This manuscript presents an integrative public-data analysis of multiple myeloma using spatial transcriptomics, Xenium spatial profiling, single-cell RNA sequencing, external bulk transcriptomic cohorts, MMRF-COMMPASS/GDC RNA-seq, and public CoMMpass molecular annotations. The study identifies a plasma-secretory bone marrow program that is enriched in myeloma spatial transcriptomics, reproduced at program level in an independent Xenium dataset, localized to plasma-cell compartments in single-cell data, and associated with overall survival, ISS stage, PR RNA-subtype probability, and 1q21 molecular-risk features in bulk datasets.</w:t>
+        <w:t xml:space="preserve">This manuscript presents an integrative public-data analysis of multiple myeloma using spatial transcriptomics, Xenium spatial profiling, single-cell RNA sequencing, external bulk transcriptomic cohorts, MMRF-COMMPASS/GDC RNA-seq, and public CoMMpass molecular annotations. The study identifies a plasma-secretory bone marrow program that is enriched and spatially clustered in myeloma spatial transcriptomics, reproduced at program level in an independent Xenium dataset, localized to plasma-cell compartments in single-cell data, and associated with overall survival, ISS stage, PR RNA-subtype probability, proliferation context, and 1q21 molecular-risk features in bulk datasets.</w:t>
       </w:r>
     </w:p>
     <w:p>
@@ -47,7 +47,7 @@
         <w:spacing w:line="276" w:lineRule="auto" w:after="160"/>
       </w:pPr>
       <w:r>
-        <w:t xml:space="preserve">The work is framed as a reproducible and clinically associated transcriptional program rather than as a completed clinical biomarker. The manuscript explicitly states that R-ISS, PFS, treatment-response validation, and wet-lab validation were not completed in the current public-data route. We believe this transparent scope is well aligned with the journal’s interest in genomic and transcriptomic analyses of disease biology.</w:t>
+        <w:t xml:space="preserve">The work is framed as a spatially reproducible transcriptional program linked to molecular-risk context rather than as an independent clinical biomarker. The manuscript explicitly states that R-ISS, PFS, treatment-response validation, prospective clinical utility, and wet-lab validation were not completed in the current public-data route. We believe this transparent scope is well aligned with the journal’s interest in genomic and transcriptomic analyses of disease biology.</w:t>
       </w:r>
     </w:p>
     <w:p>
@@ -56,7 +56,7 @@
         <w:spacing w:line="276" w:lineRule="auto" w:after="160"/>
       </w:pPr>
       <w:r>
-        <w:t xml:space="preserve">All analyzed datasets are publicly available or open-access processed resources. The analysis scripts, compact result tables, figure outputs, and validation reports are organized in a local reproducibility package and will be made publicly available before formal journal upload at https://github.com/1627626277-cyber/secondary.</w:t>
+        <w:t xml:space="preserve">All analyzed datasets are publicly available or open-access processed resources. The analysis scripts, compact result tables, figure outputs, and validation reports are organized locally and are intended to be released through https://github.com/1627626277-cyber/secondary before journal upload.</w:t>
       </w:r>
     </w:p>
     <w:p>

</xml_diff>